<commit_message>
Update Lab 2 submission: add sprint burndown data tables
Adds the burndown report tables for both sprints, showing the completion
sequence with timestamps:
  Sprint 1: 24 -> 19 -> 11 -> 8 -> 3 -> 0  (1:43 PM - 1:57 PM)
  Sprint 2: 31 -> 26 -> 18 -> 13 -> 10 -> 2 -> 0  (2:29 PM - 2:39 PM)
</commit_message>
<xml_diff>
--- a/lab2/Lab2_Jira_Submission.docx
+++ b/lab2/Lab2_Jira_Submission.docx
@@ -35,7 +35,39 @@
           <w:color w:val="555555"/>
           <w:sz w:val="21"/>
         </w:rPr>
-        <w:t>Dhanush S  ·  PES1UG24AM360  ·  Section F</w:t>
+        <w:t xml:space="preserve">Dhanush </w:t>
+      </w:r>
+      <w:proofErr w:type="gramStart"/>
+      <w:r>
+        <w:rPr>
+          <w:color w:val="555555"/>
+          <w:sz w:val="21"/>
+        </w:rPr>
+        <w:t>S  ·</w:t>
+      </w:r>
+      <w:proofErr w:type="gramEnd"/>
+      <w:r>
+        <w:rPr>
+          <w:color w:val="555555"/>
+          <w:sz w:val="21"/>
+        </w:rPr>
+        <w:t xml:space="preserve">  PES1UG24AM</w:t>
+      </w:r>
+      <w:proofErr w:type="gramStart"/>
+      <w:r>
+        <w:rPr>
+          <w:color w:val="555555"/>
+          <w:sz w:val="21"/>
+        </w:rPr>
+        <w:t>360  ·</w:t>
+      </w:r>
+      <w:proofErr w:type="gramEnd"/>
+      <w:r>
+        <w:rPr>
+          <w:color w:val="555555"/>
+          <w:sz w:val="21"/>
+        </w:rPr>
+        <w:t xml:space="preserve">  Section F</w:t>
       </w:r>
     </w:p>
     <w:p>
@@ -75,6 +107,7 @@
             <w:r>
               <w:rPr>
                 <w:i/>
+                <w:noProof/>
                 <w:color w:val="9A9A9A"/>
                 <w:sz w:val="20"/>
               </w:rPr>
@@ -161,6 +194,7 @@
             <w:r>
               <w:rPr>
                 <w:i/>
+                <w:noProof/>
                 <w:color w:val="9A9A9A"/>
                 <w:sz w:val="20"/>
               </w:rPr>
@@ -247,6 +281,7 @@
             <w:r>
               <w:rPr>
                 <w:i/>
+                <w:noProof/>
                 <w:color w:val="9A9A9A"/>
                 <w:sz w:val="20"/>
               </w:rPr>
@@ -333,6 +368,7 @@
             <w:r>
               <w:rPr>
                 <w:i/>
+                <w:noProof/>
                 <w:color w:val="9A9A9A"/>
                 <w:sz w:val="20"/>
               </w:rPr>
@@ -376,7 +412,46 @@
         </w:tc>
       </w:tr>
     </w:tbl>
+    <w:p/>
+    <w:p/>
     <w:p>
+      <w:r>
+        <w:drawing>
+          <wp:inline distT="0" distB="0" distL="0" distR="0" wp14:anchorId="6DF0F415" wp14:editId="6D5627C3">
+            <wp:extent cx="6332220" cy="3823970"/>
+            <wp:effectExtent l="0" t="0" r="0" b="5080"/>
+            <wp:docPr id="717227898" name="Picture 1"/>
+            <wp:cNvGraphicFramePr>
+              <a:graphicFrameLocks xmlns:a="http://schemas.openxmlformats.org/drawingml/2006/main" noChangeAspect="1"/>
+            </wp:cNvGraphicFramePr>
+            <a:graphic xmlns:a="http://schemas.openxmlformats.org/drawingml/2006/main">
+              <a:graphicData uri="http://schemas.openxmlformats.org/drawingml/2006/picture">
+                <pic:pic xmlns:pic="http://schemas.openxmlformats.org/drawingml/2006/picture">
+                  <pic:nvPicPr>
+                    <pic:cNvPr id="717227898" name=""/>
+                    <pic:cNvPicPr/>
+                  </pic:nvPicPr>
+                  <pic:blipFill>
+                    <a:blip r:embed="rId10"/>
+                    <a:stretch>
+                      <a:fillRect/>
+                    </a:stretch>
+                  </pic:blipFill>
+                  <pic:spPr>
+                    <a:xfrm>
+                      <a:off x="0" y="0"/>
+                      <a:ext cx="6332220" cy="3823970"/>
+                    </a:xfrm>
+                    <a:prstGeom prst="rect">
+                      <a:avLst/>
+                    </a:prstGeom>
+                  </pic:spPr>
+                </pic:pic>
+              </a:graphicData>
+            </a:graphic>
+          </wp:inline>
+        </w:drawing>
+      </w:r>
       <w:r>
         <w:br w:type="page"/>
       </w:r>
@@ -419,6 +494,7 @@
             <w:r>
               <w:rPr>
                 <w:i/>
+                <w:noProof/>
                 <w:color w:val="9A9A9A"/>
                 <w:sz w:val="20"/>
               </w:rPr>
@@ -438,7 +514,7 @@
                           <pic:cNvPicPr/>
                         </pic:nvPicPr>
                         <pic:blipFill>
-                          <a:blip r:embed="rId10"/>
+                          <a:blip r:embed="rId11"/>
                           <a:stretch>
                             <a:fillRect/>
                           </a:stretch>
@@ -505,6 +581,7 @@
             <w:r>
               <w:rPr>
                 <w:i/>
+                <w:noProof/>
                 <w:color w:val="9A9A9A"/>
                 <w:sz w:val="20"/>
               </w:rPr>
@@ -524,7 +601,7 @@
                           <pic:cNvPicPr/>
                         </pic:nvPicPr>
                         <pic:blipFill>
-                          <a:blip r:embed="rId11"/>
+                          <a:blip r:embed="rId12"/>
                           <a:stretch>
                             <a:fillRect/>
                           </a:stretch>
@@ -554,6 +631,46 @@
       </w:r>
     </w:p>
     <w:p>
+      <w:r>
+        <w:lastRenderedPageBreak/>
+        <w:drawing>
+          <wp:inline distT="0" distB="0" distL="0" distR="0" wp14:anchorId="4DCB5D23" wp14:editId="05E3747C">
+            <wp:extent cx="6332220" cy="3408045"/>
+            <wp:effectExtent l="0" t="0" r="0" b="1905"/>
+            <wp:docPr id="1038620812" name="Picture 1"/>
+            <wp:cNvGraphicFramePr>
+              <a:graphicFrameLocks xmlns:a="http://schemas.openxmlformats.org/drawingml/2006/main" noChangeAspect="1"/>
+            </wp:cNvGraphicFramePr>
+            <a:graphic xmlns:a="http://schemas.openxmlformats.org/drawingml/2006/main">
+              <a:graphicData uri="http://schemas.openxmlformats.org/drawingml/2006/picture">
+                <pic:pic xmlns:pic="http://schemas.openxmlformats.org/drawingml/2006/picture">
+                  <pic:nvPicPr>
+                    <pic:cNvPr id="1038620812" name=""/>
+                    <pic:cNvPicPr/>
+                  </pic:nvPicPr>
+                  <pic:blipFill>
+                    <a:blip r:embed="rId13"/>
+                    <a:stretch>
+                      <a:fillRect/>
+                    </a:stretch>
+                  </pic:blipFill>
+                  <pic:spPr>
+                    <a:xfrm>
+                      <a:off x="0" y="0"/>
+                      <a:ext cx="6332220" cy="3408045"/>
+                    </a:xfrm>
+                    <a:prstGeom prst="rect">
+                      <a:avLst/>
+                    </a:prstGeom>
+                  </pic:spPr>
+                </pic:pic>
+              </a:graphicData>
+            </a:graphic>
+          </wp:inline>
+        </w:drawing>
+      </w:r>
+    </w:p>
+    <w:p>
       <w:pPr>
         <w:spacing w:after="240"/>
       </w:pPr>
@@ -563,7 +680,6 @@
           <w:color w:val="1F3864"/>
           <w:sz w:val="26"/>
         </w:rPr>
-        <w:lastRenderedPageBreak/>
         <w:t>Reflection Questions</w:t>
       </w:r>
     </w:p>
@@ -608,13 +724,29 @@
         <w:spacing w:line="480" w:lineRule="auto"/>
       </w:pPr>
       <w:r>
-        <w:t>Yes. I put the basic booking flow in Sprint 1 so a guest could book a slot and submit topics end to end. That was 24 points and all of it was High or Medium priority. The Low priority stories like Request Reschedule and Attach Biography Links went to Sprint 2 because the system still works without them. One thing I would change is</w:t>
+        <w:t xml:space="preserve">Yes. I put the basic booking flow in Sprint 1 so a guest could book a slot and submit topics end to end. That was 24 points and all of it was High or Medium priority. The </w:t>
+      </w:r>
+      <w:proofErr w:type="gramStart"/>
+      <w:r>
+        <w:t>Low priority</w:t>
+      </w:r>
+      <w:proofErr w:type="gramEnd"/>
+      <w:r>
+        <w:t xml:space="preserve"> stories like Request Reschedule and Attach Biography Links went to Sprint 2 because the system still works without them. One thing I would change </w:t>
+      </w:r>
+      <w:proofErr w:type="gramStart"/>
+      <w:r>
+        <w:t>is</w:t>
       </w:r>
       <w:r>
         <w:t xml:space="preserve">  </w:t>
       </w:r>
       <w:r>
-        <w:t>Secure Episode Board Access — it is High priority but I kept it in Sprint 2.</w:t>
+        <w:t>Secure</w:t>
+      </w:r>
+      <w:proofErr w:type="gramEnd"/>
+      <w:r>
+        <w:t xml:space="preserve"> Episode Board Access — it is High priority but I kept it in Sprint 2.</w:t>
       </w:r>
     </w:p>
     <w:p>
@@ -634,7 +766,15 @@
         <w:spacing w:line="480" w:lineRule="auto"/>
       </w:pPr>
       <w:r>
-        <w:t>The scope matched my plan. Sprint 1 had 5 stories and 24 points, Sprint 2 had 6 stories and 31 points, and everything got done in both. The duration did not match though. Sprint 1 used Jira's default of 2 weeks, so all the work finished on day one and the chart stayed flat after that. For Sprint 2 I used a 1 day sprint, which is the shortest Jira allows.</w:t>
+        <w:t xml:space="preserve">The scope matched my plan. Sprint 1 had 5 stories and 24 points, Sprint 2 had 6 stories and 31 points, and everything got done in both. The duration did not match though. Sprint 1 used Jira's default of 2 weeks, so all the work finished on day one and the chart stayed flat after that. For Sprint 2 I used a </w:t>
+      </w:r>
+      <w:proofErr w:type="gramStart"/>
+      <w:r>
+        <w:t>1 day</w:t>
+      </w:r>
+      <w:proofErr w:type="gramEnd"/>
+      <w:r>
+        <w:t xml:space="preserve"> sprint, which is the shortest Jira allows.</w:t>
       </w:r>
     </w:p>
     <w:p>
@@ -646,6 +786,7 @@
           <w:b/>
           <w:sz w:val="23"/>
         </w:rPr>
+        <w:lastRenderedPageBreak/>
         <w:t>Q4.  What insights did the burndown chart give about your team's capacity?</w:t>
       </w:r>
     </w:p>
@@ -654,7 +795,23 @@
         <w:spacing w:line="480" w:lineRule="auto"/>
       </w:pPr>
       <w:r>
-        <w:t>Sprint 1's chart drops straight down from 24 to 0 at the start and then stays flat. That happens when everything is marked done at once. Sprint 2's chart is better — it goes down in steps, and each step is one story finishing. The 8 point stories made the biggest steps, which shows why smaller stories give a clearer chart. In both sprints the red line was below the grey line, so I could have taken more work. Since both sprints were simulated it does not show real capacity, but I now have a velocity of about 27 points per sprint.</w:t>
+        <w:t xml:space="preserve">Sprint 1's chart drops straight down from 24 to 0 at the start and then stays flat. That happens when everything is marked done at once. Sprint 2's chart is better — it goes down in steps, and each step is one story finishing. The </w:t>
+      </w:r>
+      <w:proofErr w:type="gramStart"/>
+      <w:r>
+        <w:t>8 point</w:t>
+      </w:r>
+      <w:proofErr w:type="gramEnd"/>
+      <w:r>
+        <w:t xml:space="preserve"> stories made the biggest steps, which shows why smaller stories give a clearer chart. In both sprints the red line was below the grey line, so I could have taken more work. Since both sprints were </w:t>
+      </w:r>
+      <w:proofErr w:type="gramStart"/>
+      <w:r>
+        <w:t>simulated</w:t>
+      </w:r>
+      <w:proofErr w:type="gramEnd"/>
+      <w:r>
+        <w:t xml:space="preserve"> it does not show real capacity, but I now have a velocity of about 27 points per sprint.</w:t>
       </w:r>
     </w:p>
     <w:p>

</xml_diff>

<commit_message>
Correct Q4 reflection: Sprint 1 burned down incrementally, not all at once
The burndown table shows five separate completions between 1:43 and 1:57 PM.
The chart only appears as a single drop because the sprint spanned two weeks.
</commit_message>
<xml_diff>
--- a/lab2/Lab2_Jira_Submission.docx
+++ b/lab2/Lab2_Jira_Submission.docx
@@ -35,39 +35,7 @@
           <w:color w:val="555555"/>
           <w:sz w:val="21"/>
         </w:rPr>
-        <w:t xml:space="preserve">Dhanush </w:t>
-      </w:r>
-      <w:proofErr w:type="gramStart"/>
-      <w:r>
-        <w:rPr>
-          <w:color w:val="555555"/>
-          <w:sz w:val="21"/>
-        </w:rPr>
-        <w:t>S  ·</w:t>
-      </w:r>
-      <w:proofErr w:type="gramEnd"/>
-      <w:r>
-        <w:rPr>
-          <w:color w:val="555555"/>
-          <w:sz w:val="21"/>
-        </w:rPr>
-        <w:t xml:space="preserve">  PES1UG24AM</w:t>
-      </w:r>
-      <w:proofErr w:type="gramStart"/>
-      <w:r>
-        <w:rPr>
-          <w:color w:val="555555"/>
-          <w:sz w:val="21"/>
-        </w:rPr>
-        <w:t>360  ·</w:t>
-      </w:r>
-      <w:proofErr w:type="gramEnd"/>
-      <w:r>
-        <w:rPr>
-          <w:color w:val="555555"/>
-          <w:sz w:val="21"/>
-        </w:rPr>
-        <w:t xml:space="preserve">  Section F</w:t>
+        <w:t>Dhanush S  ·  PES1UG24AM360  ·  Section F</w:t>
       </w:r>
     </w:p>
     <w:p>
@@ -724,29 +692,13 @@
         <w:spacing w:line="480" w:lineRule="auto"/>
       </w:pPr>
       <w:r>
-        <w:t xml:space="preserve">Yes. I put the basic booking flow in Sprint 1 so a guest could book a slot and submit topics end to end. That was 24 points and all of it was High or Medium priority. The </w:t>
-      </w:r>
-      <w:proofErr w:type="gramStart"/>
-      <w:r>
-        <w:t>Low priority</w:t>
-      </w:r>
-      <w:proofErr w:type="gramEnd"/>
-      <w:r>
-        <w:t xml:space="preserve"> stories like Request Reschedule and Attach Biography Links went to Sprint 2 because the system still works without them. One thing I would change </w:t>
-      </w:r>
-      <w:proofErr w:type="gramStart"/>
-      <w:r>
-        <w:t>is</w:t>
+        <w:t>Yes. I put the basic booking flow in Sprint 1 so a guest could book a slot and submit topics end to end. That was 24 points and all of it was High or Medium priority. The Low priority stories like Request Reschedule and Attach Biography Links went to Sprint 2 because the system still works without them. One thing I would change is</w:t>
       </w:r>
       <w:r>
         <w:t xml:space="preserve">  </w:t>
       </w:r>
       <w:r>
-        <w:t>Secure</w:t>
-      </w:r>
-      <w:proofErr w:type="gramEnd"/>
-      <w:r>
-        <w:t xml:space="preserve"> Episode Board Access — it is High priority but I kept it in Sprint 2.</w:t>
+        <w:t>Secure Episode Board Access — it is High priority but I kept it in Sprint 2.</w:t>
       </w:r>
     </w:p>
     <w:p>
@@ -766,15 +718,7 @@
         <w:spacing w:line="480" w:lineRule="auto"/>
       </w:pPr>
       <w:r>
-        <w:t xml:space="preserve">The scope matched my plan. Sprint 1 had 5 stories and 24 points, Sprint 2 had 6 stories and 31 points, and everything got done in both. The duration did not match though. Sprint 1 used Jira's default of 2 weeks, so all the work finished on day one and the chart stayed flat after that. For Sprint 2 I used a </w:t>
-      </w:r>
-      <w:proofErr w:type="gramStart"/>
-      <w:r>
-        <w:t>1 day</w:t>
-      </w:r>
-      <w:proofErr w:type="gramEnd"/>
-      <w:r>
-        <w:t xml:space="preserve"> sprint, which is the shortest Jira allows.</w:t>
+        <w:t>The scope matched my plan. Sprint 1 had 5 stories and 24 points, Sprint 2 had 6 stories and 31 points, and everything got done in both. The duration did not match though. Sprint 1 used Jira's default of 2 weeks, so all the work finished on day one and the chart stayed flat after that. For Sprint 2 I used a 1 day sprint, which is the shortest Jira allows.</w:t>
       </w:r>
     </w:p>
     <w:p>
@@ -795,29 +739,8 @@
         <w:spacing w:line="480" w:lineRule="auto"/>
       </w:pPr>
       <w:r>
-        <w:t xml:space="preserve">Sprint 1's chart drops straight down from 24 to 0 at the start and then stays flat. That happens when everything is marked done at once. Sprint 2's chart is better — it goes down in steps, and each step is one story finishing. The </w:t>
+        <w:t>Sprint 1's chart looks like one straight drop from 24 to 0 at the start. But the burndown table shows it was actually five separate completions between 1:43 and 1:57 PM. It only looks like one drop because the sprint was set to 2 weeks, so all of it got squeezed into one line. Sprint 2's chart is better — it goes down in visible steps, and each step is one story finishing. The 8 point stories made the biggest steps, which shows why smaller stories give a clearer chart. In both sprints the red line was below the grey line, so I could have taken more work. Since both sprints were simulated it does not show real capacity, but I now have a velocity of about 27 points per sprint.</w:t>
       </w:r>
-      <w:proofErr w:type="gramStart"/>
-      <w:r>
-        <w:t>8 point</w:t>
-      </w:r>
-      <w:proofErr w:type="gramEnd"/>
-      <w:r>
-        <w:t xml:space="preserve"> stories made the biggest steps, which shows why smaller stories give a clearer chart. In both sprints the red line was below the grey line, so I could have taken more work. Since both sprints were </w:t>
-      </w:r>
-      <w:proofErr w:type="gramStart"/>
-      <w:r>
-        <w:t>simulated</w:t>
-      </w:r>
-      <w:proofErr w:type="gramEnd"/>
-      <w:r>
-        <w:t xml:space="preserve"> it does not show real capacity, but I now have a velocity of about 27 points per sprint.</w:t>
-      </w:r>
-    </w:p>
-    <w:p>
-      <w:pPr>
-        <w:spacing w:line="480" w:lineRule="auto"/>
-      </w:pPr>
     </w:p>
     <w:p>
       <w:pPr>
@@ -1656,7 +1579,6 @@
   <w:style w:type="character" w:default="1" w:styleId="DefaultParagraphFont">
     <w:name w:val="Default Paragraph Font"/>
     <w:uiPriority w:val="1"/>
-    <w:semiHidden/>
     <w:unhideWhenUsed/>
   </w:style>
   <w:style w:type="table" w:default="1" w:styleId="TableNormal">

</xml_diff>